<commit_message>
Remove highlighted SCW16 report text
</commit_message>
<xml_diff>
--- a/docs/SCW16-Doc01.docx
+++ b/docs/SCW16-Doc01.docx
@@ -149,7 +149,7 @@
           <w:i/>
           <w:iCs/>
         </w:rPr>
-        <w:t xml:space="preserve">SCW16/Paper-01</w:t>
+        <w:t xml:space="preserve">SCW16-Doc01</w:t>
       </w:r>
     </w:p>
     <w:p>
@@ -157,7 +157,7 @@
         <w:pStyle w:val="BodyText"/>
       </w:pPr>
       <w:r>
-        <w:t xml:space="preserve">29 April 2026</w:t>
+        <w:t xml:space="preserve">14 June 2026</w:t>
       </w:r>
     </w:p>
     <w:bookmarkStart w:id="13" w:name="abstract"/>
@@ -3933,7 +3933,7 @@
                     <a:graphicData uri="http://schemas.openxmlformats.org/drawingml/2006/picture">
                       <pic:pic>
                         <pic:nvPicPr>
-                          <pic:cNvPr descr="SCW16-Paper-01_files/figure-docx/fig-reduced-indices-ssb-1.png" id="30" name="Picture"/>
+                          <pic:cNvPr descr="SCW16-Doc01_files/figure-docx/fig-reduced-indices-ssb-1.png" id="30" name="Picture"/>
                           <pic:cNvPicPr>
                             <a:picLocks noChangeArrowheads="1" noChangeAspect="1"/>
                           </pic:cNvPicPr>
@@ -4030,7 +4030,7 @@
                     <a:graphicData uri="http://schemas.openxmlformats.org/drawingml/2006/picture">
                       <pic:pic>
                         <pic:nvPicPr>
-                          <pic:cNvPr descr="SCW16-Paper-01_files/figure-docx/fig-reduced-indices-rec-1.png" id="34" name="Picture"/>
+                          <pic:cNvPr descr="SCW16-Doc01_files/figure-docx/fig-reduced-indices-rec-1.png" id="34" name="Picture"/>
                           <pic:cNvPicPr>
                             <a:picLocks noChangeArrowheads="1" noChangeAspect="1"/>
                           </pic:cNvPicPr>
@@ -5364,7 +5364,7 @@
                           <a:graphicData uri="http://schemas.openxmlformats.org/drawingml/2006/picture">
                             <pic:pic>
                               <pic:nvPicPr>
-                                <pic:cNvPr descr="SCW16-Paper-01_files/figure-docx/fig-selectivity-fishery-compare-1.png" id="48" name="Picture"/>
+                                <pic:cNvPr descr="SCW16-Doc01_files/figure-docx/fig-selectivity-fishery-compare-1.png" id="48" name="Picture"/>
                                 <pic:cNvPicPr>
                                   <a:picLocks noChangeArrowheads="1" noChangeAspect="1"/>
                                 </pic:cNvPicPr>
@@ -5458,7 +5458,7 @@
                           <a:graphicData uri="http://schemas.openxmlformats.org/drawingml/2006/picture">
                             <pic:pic>
                               <pic:nvPicPr>
-                                <pic:cNvPr descr="SCW16-Paper-01_files/figure-docx/fig-selectivity-fishery-compare-2.png" id="52" name="Picture"/>
+                                <pic:cNvPr descr="SCW16-Doc01_files/figure-docx/fig-selectivity-fishery-compare-2.png" id="52" name="Picture"/>
                                 <pic:cNvPicPr>
                                   <a:picLocks noChangeArrowheads="1" noChangeAspect="1"/>
                                 </pic:cNvPicPr>
@@ -5600,7 +5600,7 @@
                     <a:graphicData uri="http://schemas.openxmlformats.org/drawingml/2006/picture">
                       <pic:pic>
                         <pic:nvPicPr>
-                          <pic:cNvPr descr="SCW16-Paper-01_files/figure-docx/fig-selectivity-blocks-ssb-1.png" id="57" name="Picture"/>
+                          <pic:cNvPr descr="SCW16-Doc01_files/figure-docx/fig-selectivity-blocks-ssb-1.png" id="57" name="Picture"/>
                           <pic:cNvPicPr>
                             <a:picLocks noChangeArrowheads="1" noChangeAspect="1"/>
                           </pic:cNvPicPr>
@@ -5697,7 +5697,7 @@
                     <a:graphicData uri="http://schemas.openxmlformats.org/drawingml/2006/picture">
                       <pic:pic>
                         <pic:nvPicPr>
-                          <pic:cNvPr descr="SCW16-Paper-01_files/figure-docx/fig-selectivity-blocks-rec-1.png" id="61" name="Picture"/>
+                          <pic:cNvPr descr="SCW16-Doc01_files/figure-docx/fig-selectivity-blocks-rec-1.png" id="61" name="Picture"/>
                           <pic:cNvPicPr>
                             <a:picLocks noChangeArrowheads="1" noChangeAspect="1"/>
                           </pic:cNvPicPr>
@@ -5794,7 +5794,7 @@
                     <a:graphicData uri="http://schemas.openxmlformats.org/drawingml/2006/picture">
                       <pic:pic>
                         <pic:nvPicPr>
-                          <pic:cNvPr descr="SCW16-Paper-01_files/figure-docx/fig-selectivity-sc-allowance-ssb-1.png" id="65" name="Picture"/>
+                          <pic:cNvPr descr="SCW16-Doc01_files/figure-docx/fig-selectivity-sc-allowance-ssb-1.png" id="65" name="Picture"/>
                           <pic:cNvPicPr>
                             <a:picLocks noChangeArrowheads="1" noChangeAspect="1"/>
                           </pic:cNvPicPr>
@@ -8596,7 +8596,7 @@
                     <a:graphicData uri="http://schemas.openxmlformats.org/drawingml/2006/picture">
                       <pic:pic>
                         <pic:nvPicPr>
-                          <pic:cNvPr descr="SCW16-Paper-01_files/figure-docx/fig-h1-index-fits-1.png" id="70" name="Picture"/>
+                          <pic:cNvPr descr="SCW16-Doc01_files/figure-docx/fig-h1-index-fits-1.png" id="70" name="Picture"/>
                           <pic:cNvPicPr>
                             <a:picLocks noChangeArrowheads="1" noChangeAspect="1"/>
                           </pic:cNvPicPr>
@@ -9184,7 +9184,7 @@
                           <a:graphicData uri="http://schemas.openxmlformats.org/drawingml/2006/picture">
                             <pic:pic>
                               <pic:nvPicPr>
-                                <pic:cNvPr descr="SCW16-Paper-01_files/figure-docx/fig-selectivity-sc-allowance-compare-1.png" id="76" name="Picture"/>
+                                <pic:cNvPr descr="SCW16-Doc01_files/figure-docx/fig-selectivity-sc-allowance-compare-1.png" id="76" name="Picture"/>
                                 <pic:cNvPicPr>
                                   <a:picLocks noChangeArrowheads="1" noChangeAspect="1"/>
                                 </pic:cNvPicPr>
@@ -9278,7 +9278,7 @@
                           <a:graphicData uri="http://schemas.openxmlformats.org/drawingml/2006/picture">
                             <pic:pic>
                               <pic:nvPicPr>
-                                <pic:cNvPr descr="SCW16-Paper-01_files/figure-docx/fig-selectivity-sc-allowance-compare-2.png" id="80" name="Picture"/>
+                                <pic:cNvPr descr="SCW16-Doc01_files/figure-docx/fig-selectivity-sc-allowance-compare-2.png" id="80" name="Picture"/>
                                 <pic:cNvPicPr>
                                   <a:picLocks noChangeArrowheads="1" noChangeAspect="1"/>
                                 </pic:cNvPicPr>
@@ -12326,7 +12326,7 @@
                     <a:graphicData uri="http://schemas.openxmlformats.org/drawingml/2006/picture">
                       <pic:pic>
                         <pic:nvPicPr>
-                          <pic:cNvPr descr="SCW16-Paper-01_files/figure-docx/fig-selectivity-sc5-index-fits-1.png" id="86" name="Picture"/>
+                          <pic:cNvPr descr="SCW16-Doc01_files/figure-docx/fig-selectivity-sc5-index-fits-1.png" id="86" name="Picture"/>
                           <pic:cNvPicPr>
                             <a:picLocks noChangeArrowheads="1" noChangeAspect="1"/>
                           </pic:cNvPicPr>
@@ -15453,7 +15453,7 @@
                     <a:graphicData uri="http://schemas.openxmlformats.org/drawingml/2006/picture">
                       <pic:pic>
                         <pic:nvPicPr>
-                          <pic:cNvPr descr="SCW16-Paper-01_files/figure-docx/fig-selectivity-sc5-qtrend-1.png" id="91" name="Picture"/>
+                          <pic:cNvPr descr="SCW16-Doc01_files/figure-docx/fig-selectivity-sc5-qtrend-1.png" id="91" name="Picture"/>
                           <pic:cNvPicPr>
                             <a:picLocks noChangeArrowheads="1" noChangeAspect="1"/>
                           </pic:cNvPicPr>
@@ -15560,7 +15560,7 @@
                           <a:graphicData uri="http://schemas.openxmlformats.org/drawingml/2006/picture">
                             <pic:pic>
                               <pic:nvPicPr>
-                                <pic:cNvPr descr="SCW16-Paper-01_files/figure-docx/fig-selectivity-sc5-compare-1.png" id="95" name="Picture"/>
+                                <pic:cNvPr descr="SCW16-Doc01_files/figure-docx/fig-selectivity-sc5-compare-1.png" id="95" name="Picture"/>
                                 <pic:cNvPicPr>
                                   <a:picLocks noChangeArrowheads="1" noChangeAspect="1"/>
                                 </pic:cNvPicPr>
@@ -15654,7 +15654,7 @@
                           <a:graphicData uri="http://schemas.openxmlformats.org/drawingml/2006/picture">
                             <pic:pic>
                               <pic:nvPicPr>
-                                <pic:cNvPr descr="SCW16-Paper-01_files/figure-docx/fig-selectivity-sc5-compare-2.png" id="99" name="Picture"/>
+                                <pic:cNvPr descr="SCW16-Doc01_files/figure-docx/fig-selectivity-sc5-compare-2.png" id="99" name="Picture"/>
                                 <pic:cNvPicPr>
                                   <a:picLocks noChangeArrowheads="1" noChangeAspect="1"/>
                                 </pic:cNvPicPr>
@@ -15796,7 +15796,7 @@
                     <a:graphicData uri="http://schemas.openxmlformats.org/drawingml/2006/picture">
                       <pic:pic>
                         <pic:nvPicPr>
-                          <pic:cNvPr descr="SCW16-Paper-01_files/figure-docx/fig-selectivity-sc5-ssb-1.png" id="104" name="Picture"/>
+                          <pic:cNvPr descr="SCW16-Doc01_files/figure-docx/fig-selectivity-sc5-ssb-1.png" id="104" name="Picture"/>
                           <pic:cNvPicPr>
                             <a:picLocks noChangeArrowheads="1" noChangeAspect="1"/>
                           </pic:cNvPicPr>
@@ -18890,7 +18890,7 @@
                     <a:graphicData uri="http://schemas.openxmlformats.org/drawingml/2006/picture">
                       <pic:pic>
                         <pic:nvPicPr>
-                          <pic:cNvPr descr="SCW16-Paper-01_files/figure-docx/fig-harmonized-index-fits-1.png" id="114" name="Picture"/>
+                          <pic:cNvPr descr="SCW16-Doc01_files/figure-docx/fig-harmonized-index-fits-1.png" id="114" name="Picture"/>
                           <pic:cNvPicPr>
                             <a:picLocks noChangeArrowheads="1" noChangeAspect="1"/>
                           </pic:cNvPicPr>
@@ -19087,7 +19087,7 @@
                     <a:graphicData uri="http://schemas.openxmlformats.org/drawingml/2006/picture">
                       <pic:pic>
                         <pic:nvPicPr>
-                          <pic:cNvPr descr="SCW16-Paper-01_files/figure-docx/fig-harmonized-ssb-1.png" id="118" name="Picture"/>
+                          <pic:cNvPr descr="SCW16-Doc01_files/figure-docx/fig-harmonized-ssb-1.png" id="118" name="Picture"/>
                           <pic:cNvPicPr>
                             <a:picLocks noChangeArrowheads="1" noChangeAspect="1"/>
                           </pic:cNvPicPr>
@@ -19214,7 +19214,7 @@
                     <a:graphicData uri="http://schemas.openxmlformats.org/drawingml/2006/picture">
                       <pic:pic>
                         <pic:nvPicPr>
-                          <pic:cNvPr descr="SCW16-Paper-01_files/figure-docx/fig-harmonized-rec-1.png" id="122" name="Picture"/>
+                          <pic:cNvPr descr="SCW16-Doc01_files/figure-docx/fig-harmonized-rec-1.png" id="122" name="Picture"/>
                           <pic:cNvPicPr>
                             <a:picLocks noChangeArrowheads="1" noChangeAspect="1"/>
                           </pic:cNvPicPr>
@@ -20124,7 +20124,7 @@
                     <a:graphicData uri="http://schemas.openxmlformats.org/drawingml/2006/picture">
                       <pic:pic>
                         <pic:nvPicPr>
-                          <pic:cNvPr descr="SCW16-Paper-01_files/figure-docx/fig-h2-sr-compare-1.png" id="129" name="Picture"/>
+                          <pic:cNvPr descr="SCW16-Doc01_files/figure-docx/fig-h2-sr-compare-1.png" id="129" name="Picture"/>
                           <pic:cNvPicPr>
                             <a:picLocks noChangeArrowheads="1" noChangeAspect="1"/>
                           </pic:cNvPicPr>
@@ -20452,7 +20452,7 @@
                     <a:graphicData uri="http://schemas.openxmlformats.org/drawingml/2006/picture">
                       <pic:pic>
                         <pic:nvPicPr>
-                          <pic:cNvPr descr="SCW16-Paper-01_files/figure-docx/fig-h2-stock2-ssb-1.png" id="133" name="Picture"/>
+                          <pic:cNvPr descr="SCW16-Doc01_files/figure-docx/fig-h2-stock2-ssb-1.png" id="133" name="Picture"/>
                           <pic:cNvPicPr>
                             <a:picLocks noChangeArrowheads="1" noChangeAspect="1"/>
                           </pic:cNvPicPr>
@@ -20558,7 +20558,7 @@
                     <a:graphicData uri="http://schemas.openxmlformats.org/drawingml/2006/picture">
                       <pic:pic>
                         <pic:nvPicPr>
-                          <pic:cNvPr descr="SCW16-Paper-01_files/figure-docx/fig-h2-stock2-rec-1.png" id="137" name="Picture"/>
+                          <pic:cNvPr descr="SCW16-Doc01_files/figure-docx/fig-h2-stock2-rec-1.png" id="137" name="Picture"/>
                           <pic:cNvPicPr>
                             <a:picLocks noChangeArrowheads="1" noChangeAspect="1"/>
                           </pic:cNvPicPr>
@@ -21087,7 +21087,7 @@
                     <a:graphicData uri="http://schemas.openxmlformats.org/drawingml/2006/picture">
                       <pic:pic>
                         <pic:nvPicPr>
-                          <pic:cNvPr descr="SCW16-Paper-01_files/figure-docx/fig-mean-selected-age-1.png" id="142" name="Picture"/>
+                          <pic:cNvPr descr="SCW16-Doc01_files/figure-docx/fig-mean-selected-age-1.png" id="142" name="Picture"/>
                           <pic:cNvPicPr>
                             <a:picLocks noChangeArrowheads="1" noChangeAspect="1"/>
                           </pic:cNvPicPr>
@@ -21518,7 +21518,7 @@
                     <a:graphicData uri="http://schemas.openxmlformats.org/drawingml/2006/picture">
                       <pic:pic>
                         <pic:nvPicPr>
-                          <pic:cNvPr descr="SCW16-Paper-01_files/figure-docx/fig-mean-selected-age-fmsy-1.png" id="146" name="Picture"/>
+                          <pic:cNvPr descr="SCW16-Doc01_files/figure-docx/fig-mean-selected-age-fmsy-1.png" id="146" name="Picture"/>
                           <pic:cNvPicPr>
                             <a:picLocks noChangeArrowheads="1" noChangeAspect="1"/>
                           </pic:cNvPicPr>
@@ -22326,173 +22326,6 @@
         <w:rPr>
           <w:b/>
           <w:bCs/>
-          <w:highlight w:val="yellow"/>
-        </w:rPr>
-        <w:t xml:space="preserve">The Far North recruitment-regime structure should remain a benchmark axis, with the single-regime version retained as a diagnostic sensitivity.</w:t>
-      </w:r>
-      <w:r>
-        <w:rPr>
-          <w:highlight w:val="yellow"/>
-        </w:rPr>
-        <w:t xml:space="preserve"> </w:t>
-      </w:r>
-      <w:r>
-        <w:rPr>
-          <w:highlight w:val="yellow"/>
-        </w:rPr>
-        <w:t xml:space="preserve">Model</w:t>
-      </w:r>
-      <w:r>
-        <w:rPr>
-          <w:highlight w:val="yellow"/>
-        </w:rPr>
-        <w:t xml:space="preserve"> </w:t>
-      </w:r>
-      <w:r>
-        <w:rPr>
-          <w:rStyle w:val="VerbatimChar"/>
-          <w:highlight w:val="yellow"/>
-        </w:rPr>
-        <w:t xml:space="preserve">h2_2.03</w:t>
-      </w:r>
-      <w:r>
-        <w:rPr>
-          <w:highlight w:val="yellow"/>
-        </w:rPr>
-        <w:t xml:space="preserve"> </w:t>
-      </w:r>
-      <w:r>
-        <w:rPr>
-          <w:highlight w:val="yellow"/>
-        </w:rPr>
-        <w:t xml:space="preserve">converges cleanly and only modestly worsens the objective function relative to</w:t>
-      </w:r>
-      <w:r>
-        <w:rPr>
-          <w:highlight w:val="yellow"/>
-        </w:rPr>
-        <w:t xml:space="preserve"> </w:t>
-      </w:r>
-      <w:r>
-        <w:rPr>
-          <w:rStyle w:val="VerbatimChar"/>
-          <w:highlight w:val="yellow"/>
-        </w:rPr>
-        <w:t xml:space="preserve">h2_2.02</w:t>
-      </w:r>
-      <w:r>
-        <w:rPr>
-          <w:highlight w:val="yellow"/>
-        </w:rPr>
-        <w:t xml:space="preserve">, so a single stock-2 relationship is computationally workable. However, the external evidence for a late-1990s productivity shift in the northern Humboldt system argues against treating this collapse as the preferred benchmark simplification. The stock-recruitment comparison also makes clearer that</w:t>
-      </w:r>
-      <w:r>
-        <w:rPr>
-          <w:highlight w:val="yellow"/>
-        </w:rPr>
-        <w:t xml:space="preserve"> </w:t>
-      </w:r>
-      <w:r>
-        <w:rPr>
-          <w:rStyle w:val="VerbatimChar"/>
-          <w:highlight w:val="yellow"/>
-        </w:rPr>
-        <w:t xml:space="preserve">h2_1.14</w:t>
-      </w:r>
-      <w:r>
-        <w:rPr>
-          <w:highlight w:val="yellow"/>
-        </w:rPr>
-        <w:t xml:space="preserve"> </w:t>
-      </w:r>
-      <w:r>
-        <w:rPr>
-          <w:highlight w:val="yellow"/>
-        </w:rPr>
-        <w:t xml:space="preserve">and</w:t>
-      </w:r>
-      <w:r>
-        <w:rPr>
-          <w:highlight w:val="yellow"/>
-        </w:rPr>
-        <w:t xml:space="preserve"> </w:t>
-      </w:r>
-      <w:r>
-        <w:rPr>
-          <w:rStyle w:val="VerbatimChar"/>
-          <w:highlight w:val="yellow"/>
-        </w:rPr>
-        <w:t xml:space="preserve">h2_2.02</w:t>
-      </w:r>
-      <w:r>
-        <w:rPr>
-          <w:highlight w:val="yellow"/>
-        </w:rPr>
-        <w:t xml:space="preserve"> </w:t>
-      </w:r>
-      <w:r>
-        <w:rPr>
-          <w:highlight w:val="yellow"/>
-        </w:rPr>
-        <w:t xml:space="preserve">estimated stock-2 relationships using restricted hatch-year windows and omitted hatch years</w:t>
-      </w:r>
-      <w:r>
-        <w:rPr>
-          <w:highlight w:val="yellow"/>
-        </w:rPr>
-        <w:t xml:space="preserve"> </w:t>
-      </w:r>
-      <w:r>
-        <w:rPr>
-          <w:rStyle w:val="VerbatimChar"/>
-          <w:highlight w:val="yellow"/>
-        </w:rPr>
-        <w:t xml:space="preserve">1997-2000</w:t>
-      </w:r>
-      <w:r>
-        <w:rPr>
-          <w:highlight w:val="yellow"/>
-        </w:rPr>
-        <w:t xml:space="preserve">, whereas</w:t>
-      </w:r>
-      <w:r>
-        <w:rPr>
-          <w:highlight w:val="yellow"/>
-        </w:rPr>
-        <w:t xml:space="preserve"> </w:t>
-      </w:r>
-      <w:r>
-        <w:rPr>
-          <w:rStyle w:val="VerbatimChar"/>
-          <w:highlight w:val="yellow"/>
-        </w:rPr>
-        <w:t xml:space="preserve">h2_2.03</w:t>
-      </w:r>
-      <w:r>
-        <w:rPr>
-          <w:highlight w:val="yellow"/>
-        </w:rPr>
-        <w:t xml:space="preserve"> </w:t>
-      </w:r>
-      <w:r>
-        <w:rPr>
-          <w:highlight w:val="yellow"/>
-        </w:rPr>
-        <w:t xml:space="preserve">removes that gap by fitting one relationship across the combined period. The choice is therefore not only about the number of regimes; it also changes which years are allowed to inform the fitted stock-2 stock-recruitment relationship.</w:t>
-      </w:r>
-    </w:p>
-    <w:p>
-      <w:pPr>
-        <w:pStyle w:val="Compact"/>
-        <w:numPr>
-          <w:ilvl w:val="0"/>
-          <w:numId w:val="1011"/>
-        </w:numPr>
-      </w:pPr>
-      <w:r>
-        <w:rPr>
-          <w:b/>
-          <w:bCs/>
         </w:rPr>
         <w:t xml:space="preserve">The strongest current operating-model candidates are now better defined.</w:t>
       </w:r>
@@ -22735,15 +22568,6 @@
       </w:r>
       <w:r>
         <w:t xml:space="preserve">Projection-period selectivity uncertainty should still be explored using averaging-window alternatives, but reference points are likely to be more stable and interpretable if calculated from period means (multi-year averaged selectivity and related schedules) and then fixed for simulation.</w:t>
-      </w:r>
-      <w:r>
-        <w:t xml:space="preserve"> </w:t>
-      </w:r>
-      <w:r>
-        <w:rPr>
-          <w:highlight w:val="yellow"/>
-        </w:rPr>
-        <w:t xml:space="preserve">Far North productivity-regime structure should be treated as an explicit operating-model axis, and northern biology uncertainty and index-standardization choices remain natural later-phase candidates.</w:t>
       </w:r>
     </w:p>
     <w:p>

</xml_diff>